<commit_message>
Release 1.0.0 packaging (Windows and Ubuntu bundles), install guide 1.1, wait for temp topic leaders in bus tests
Co-authored-by: Cursor <cursoragent@cursor.com>
</commit_message>
<xml_diff>
--- a/DxPS_Installation_and_Running_Guide.docx
+++ b/DxPS_Installation_and_Running_Guide.docx
@@ -352,7 +352,7 @@
                 <w:rFonts w:eastAsia="Calibri"/>
                 <w:sz w:val="17"/>
               </w:rPr>
-              <w:t>1.0</w:t>
+              <w:t>1.1</w:t>
             </w:r>
           </w:p>
         </w:tc>
@@ -385,7 +385,7 @@
                 <w:rFonts w:eastAsia="Calibri"/>
                 <w:sz w:val="17"/>
               </w:rPr>
-              <w:t>06 October 2026</w:t>
+              <w:t>07 October 2026</w:t>
             </w:r>
           </w:p>
         </w:tc>
@@ -420,7 +420,7 @@
                 <w:rFonts w:eastAsia="Calibri"/>
                 <w:sz w:val="17"/>
               </w:rPr>
-              <w:t>dxps source package of the same date; Go 1.26.6, PostgreSQL 18, Apache Kafka 4.3.1</w:t>
+              <w:t>DxPS release 1.0.0; Go 1.26.6, PostgreSQL 18, Apache Kafka 4.3.1</w:t>
             </w:r>
           </w:p>
         </w:tc>
@@ -470,7 +470,7 @@
       <w:r>
         <w:fldChar w:fldCharType="separate"/>
       </w:r>
-      <w:hyperlink w:anchor="_Toc242216704" w:history="1">
+      <w:hyperlink w:anchor="_Toc242270645" w:history="1">
         <w:r>
           <w:rPr>
             <w:rStyle w:val="Hyperlink"/>
@@ -497,7 +497,7 @@
             <w:noProof/>
             <w:webHidden/>
           </w:rPr>
-          <w:instrText xml:space="preserve"> PAGEREF _Toc242216704 \h </w:instrText>
+          <w:instrText xml:space="preserve"> PAGEREF _Toc242270645 \h </w:instrText>
         </w:r>
         <w:r>
           <w:rPr>
@@ -538,7 +538,7 @@
           <w:noProof/>
         </w:rPr>
       </w:pPr>
-      <w:hyperlink w:anchor="_Toc242216705" w:history="1">
+      <w:hyperlink w:anchor="_Toc242270646" w:history="1">
         <w:r>
           <w:rPr>
             <w:rStyle w:val="Hyperlink"/>
@@ -565,7 +565,7 @@
             <w:noProof/>
             <w:webHidden/>
           </w:rPr>
-          <w:instrText xml:space="preserve"> PAGEREF _Toc242216705 \h </w:instrText>
+          <w:instrText xml:space="preserve"> PAGEREF _Toc242270646 \h </w:instrText>
         </w:r>
         <w:r>
           <w:rPr>
@@ -606,7 +606,7 @@
           <w:noProof/>
         </w:rPr>
       </w:pPr>
-      <w:hyperlink w:anchor="_Toc242216706" w:history="1">
+      <w:hyperlink w:anchor="_Toc242270647" w:history="1">
         <w:r>
           <w:rPr>
             <w:rStyle w:val="Hyperlink"/>
@@ -633,7 +633,7 @@
             <w:noProof/>
             <w:webHidden/>
           </w:rPr>
-          <w:instrText xml:space="preserve"> PAGEREF _Toc242216706 \h </w:instrText>
+          <w:instrText xml:space="preserve"> PAGEREF _Toc242270647 \h </w:instrText>
         </w:r>
         <w:r>
           <w:rPr>
@@ -674,7 +674,7 @@
           <w:noProof/>
         </w:rPr>
       </w:pPr>
-      <w:hyperlink w:anchor="_Toc242216707" w:history="1">
+      <w:hyperlink w:anchor="_Toc242270648" w:history="1">
         <w:r>
           <w:rPr>
             <w:rStyle w:val="Hyperlink"/>
@@ -701,7 +701,7 @@
             <w:noProof/>
             <w:webHidden/>
           </w:rPr>
-          <w:instrText xml:space="preserve"> PAGEREF _Toc242216707 \h </w:instrText>
+          <w:instrText xml:space="preserve"> PAGEREF _Toc242270648 \h </w:instrText>
         </w:r>
         <w:r>
           <w:rPr>
@@ -742,7 +742,7 @@
           <w:noProof/>
         </w:rPr>
       </w:pPr>
-      <w:hyperlink w:anchor="_Toc242216708" w:history="1">
+      <w:hyperlink w:anchor="_Toc242270649" w:history="1">
         <w:r>
           <w:rPr>
             <w:rStyle w:val="Hyperlink"/>
@@ -769,7 +769,7 @@
             <w:noProof/>
             <w:webHidden/>
           </w:rPr>
-          <w:instrText xml:space="preserve"> PAGEREF _Toc242216708 \h </w:instrText>
+          <w:instrText xml:space="preserve"> PAGEREF _Toc242270649 \h </w:instrText>
         </w:r>
         <w:r>
           <w:rPr>
@@ -810,7 +810,7 @@
           <w:noProof/>
         </w:rPr>
       </w:pPr>
-      <w:hyperlink w:anchor="_Toc242216709" w:history="1">
+      <w:hyperlink w:anchor="_Toc242270650" w:history="1">
         <w:r>
           <w:rPr>
             <w:rStyle w:val="Hyperlink"/>
@@ -837,7 +837,7 @@
             <w:noProof/>
             <w:webHidden/>
           </w:rPr>
-          <w:instrText xml:space="preserve"> PAGEREF _Toc242216709 \h </w:instrText>
+          <w:instrText xml:space="preserve"> PAGEREF _Toc242270650 \h </w:instrText>
         </w:r>
         <w:r>
           <w:rPr>
@@ -878,7 +878,7 @@
           <w:noProof/>
         </w:rPr>
       </w:pPr>
-      <w:hyperlink w:anchor="_Toc242216710" w:history="1">
+      <w:hyperlink w:anchor="_Toc242270651" w:history="1">
         <w:r>
           <w:rPr>
             <w:rStyle w:val="Hyperlink"/>
@@ -905,7 +905,7 @@
             <w:noProof/>
             <w:webHidden/>
           </w:rPr>
-          <w:instrText xml:space="preserve"> PAGEREF _Toc242216710 \h </w:instrText>
+          <w:instrText xml:space="preserve"> PAGEREF _Toc242270651 \h </w:instrText>
         </w:r>
         <w:r>
           <w:rPr>
@@ -946,7 +946,7 @@
           <w:noProof/>
         </w:rPr>
       </w:pPr>
-      <w:hyperlink w:anchor="_Toc242216711" w:history="1">
+      <w:hyperlink w:anchor="_Toc242270652" w:history="1">
         <w:r>
           <w:rPr>
             <w:rStyle w:val="Hyperlink"/>
@@ -973,7 +973,7 @@
             <w:noProof/>
             <w:webHidden/>
           </w:rPr>
-          <w:instrText xml:space="preserve"> PAGEREF _Toc242216711 \h </w:instrText>
+          <w:instrText xml:space="preserve"> PAGEREF _Toc242270652 \h </w:instrText>
         </w:r>
         <w:r>
           <w:rPr>
@@ -1014,7 +1014,7 @@
           <w:noProof/>
         </w:rPr>
       </w:pPr>
-      <w:hyperlink w:anchor="_Toc242216712" w:history="1">
+      <w:hyperlink w:anchor="_Toc242270653" w:history="1">
         <w:r>
           <w:rPr>
             <w:rStyle w:val="Hyperlink"/>
@@ -1041,7 +1041,7 @@
             <w:noProof/>
             <w:webHidden/>
           </w:rPr>
-          <w:instrText xml:space="preserve"> PAGEREF _Toc242216712 \h </w:instrText>
+          <w:instrText xml:space="preserve"> PAGEREF _Toc242270653 \h </w:instrText>
         </w:r>
         <w:r>
           <w:rPr>
@@ -1082,7 +1082,7 @@
           <w:noProof/>
         </w:rPr>
       </w:pPr>
-      <w:hyperlink w:anchor="_Toc242216713" w:history="1">
+      <w:hyperlink w:anchor="_Toc242270654" w:history="1">
         <w:r>
           <w:rPr>
             <w:rStyle w:val="Hyperlink"/>
@@ -1109,7 +1109,7 @@
             <w:noProof/>
             <w:webHidden/>
           </w:rPr>
-          <w:instrText xml:space="preserve"> PAGEREF _Toc242216713 \h </w:instrText>
+          <w:instrText xml:space="preserve"> PAGEREF _Toc242270654 \h </w:instrText>
         </w:r>
         <w:r>
           <w:rPr>
@@ -1150,7 +1150,7 @@
           <w:noProof/>
         </w:rPr>
       </w:pPr>
-      <w:hyperlink w:anchor="_Toc242216714" w:history="1">
+      <w:hyperlink w:anchor="_Toc242270655" w:history="1">
         <w:r>
           <w:rPr>
             <w:rStyle w:val="Hyperlink"/>
@@ -1177,7 +1177,7 @@
             <w:noProof/>
             <w:webHidden/>
           </w:rPr>
-          <w:instrText xml:space="preserve"> PAGEREF _Toc242216714 \h </w:instrText>
+          <w:instrText xml:space="preserve"> PAGEREF _Toc242270655 \h </w:instrText>
         </w:r>
         <w:r>
           <w:rPr>
@@ -1218,7 +1218,7 @@
           <w:noProof/>
         </w:rPr>
       </w:pPr>
-      <w:hyperlink w:anchor="_Toc242216715" w:history="1">
+      <w:hyperlink w:anchor="_Toc242270656" w:history="1">
         <w:r>
           <w:rPr>
             <w:rStyle w:val="Hyperlink"/>
@@ -1245,7 +1245,7 @@
             <w:noProof/>
             <w:webHidden/>
           </w:rPr>
-          <w:instrText xml:space="preserve"> PAGEREF _Toc242216715 \h </w:instrText>
+          <w:instrText xml:space="preserve"> PAGEREF _Toc242270656 \h </w:instrText>
         </w:r>
         <w:r>
           <w:rPr>
@@ -1286,7 +1286,7 @@
           <w:noProof/>
         </w:rPr>
       </w:pPr>
-      <w:hyperlink w:anchor="_Toc242216716" w:history="1">
+      <w:hyperlink w:anchor="_Toc242270657" w:history="1">
         <w:r>
           <w:rPr>
             <w:rStyle w:val="Hyperlink"/>
@@ -1313,7 +1313,7 @@
             <w:noProof/>
             <w:webHidden/>
           </w:rPr>
-          <w:instrText xml:space="preserve"> PAGEREF _Toc242216716 \h </w:instrText>
+          <w:instrText xml:space="preserve"> PAGEREF _Toc242270657 \h </w:instrText>
         </w:r>
         <w:r>
           <w:rPr>
@@ -1354,7 +1354,7 @@
           <w:noProof/>
         </w:rPr>
       </w:pPr>
-      <w:hyperlink w:anchor="_Toc242216717" w:history="1">
+      <w:hyperlink w:anchor="_Toc242270658" w:history="1">
         <w:r>
           <w:rPr>
             <w:rStyle w:val="Hyperlink"/>
@@ -1381,7 +1381,7 @@
             <w:noProof/>
             <w:webHidden/>
           </w:rPr>
-          <w:instrText xml:space="preserve"> PAGEREF _Toc242216717 \h </w:instrText>
+          <w:instrText xml:space="preserve"> PAGEREF _Toc242270658 \h </w:instrText>
         </w:r>
         <w:r>
           <w:rPr>
@@ -1422,7 +1422,7 @@
           <w:noProof/>
         </w:rPr>
       </w:pPr>
-      <w:hyperlink w:anchor="_Toc242216718" w:history="1">
+      <w:hyperlink w:anchor="_Toc242270659" w:history="1">
         <w:r>
           <w:rPr>
             <w:rStyle w:val="Hyperlink"/>
@@ -1449,7 +1449,7 @@
             <w:noProof/>
             <w:webHidden/>
           </w:rPr>
-          <w:instrText xml:space="preserve"> PAGEREF _Toc242216718 \h </w:instrText>
+          <w:instrText xml:space="preserve"> PAGEREF _Toc242270659 \h </w:instrText>
         </w:r>
         <w:r>
           <w:rPr>
@@ -1494,7 +1494,7 @@
       <w:pPr>
         <w:pStyle w:val="Heading1"/>
       </w:pPr>
-      <w:bookmarkStart w:id="0" w:name="_Toc242216704"/>
+      <w:bookmarkStart w:id="0" w:name="_Toc242270645"/>
       <w:r>
         <w:rPr>
           <w:color w:val="1E3A8A"/>
@@ -1997,7 +1997,7 @@
       <w:pPr>
         <w:pStyle w:val="Heading1"/>
       </w:pPr>
-      <w:bookmarkStart w:id="1" w:name="_Toc242216705"/>
+      <w:bookmarkStart w:id="1" w:name="_Toc242270646"/>
       <w:r>
         <w:rPr>
           <w:color w:val="1E3A8A"/>
@@ -2812,7 +2812,7 @@
       <w:pPr>
         <w:pStyle w:val="Heading1"/>
       </w:pPr>
-      <w:bookmarkStart w:id="2" w:name="_Toc242216706"/>
+      <w:bookmarkStart w:id="2" w:name="_Toc242270647"/>
       <w:r>
         <w:rPr>
           <w:color w:val="1E3A8A"/>
@@ -2823,6 +2823,18 @@
     </w:p>
     <w:p>
       <w:pPr>
+        <w:spacing w:after="80"/>
+      </w:pPr>
+      <w:r>
+        <w:rPr>
+          <w:rFonts w:eastAsia="Calibri"/>
+          <w:sz w:val="21"/>
+        </w:rPr>
+        <w:t>The release (GitHub release v&lt;version&gt;, or the DxPS_Delivery_&lt;date&gt; folder) contains:</w:t>
+      </w:r>
+    </w:p>
+    <w:p>
+      <w:pPr>
         <w:shd w:val="clear" w:color="auto" w:fill="F3F4F6"/>
         <w:spacing w:before="60" w:after="120"/>
         <w:ind w:left="144"/>
@@ -2832,7 +2844,7 @@
           <w:rFonts w:ascii="Consolas" w:eastAsia="Consolas" w:hAnsi="Consolas"/>
           <w:sz w:val="16"/>
         </w:rPr>
-        <w:t>DxPS_Delivery_&lt;date&gt;/</w:t>
+        <w:t>dxps-&lt;version&gt;-windows.zip        Windows bundle (source, scripts, manuals)</w:t>
       </w:r>
       <w:r>
         <w:rPr>
@@ -2840,7 +2852,7 @@
           <w:sz w:val="16"/>
         </w:rPr>
         <w:br/>
-        <w:t xml:space="preserve">  README.txt                       start here</w:t>
+        <w:t>dxps-&lt;version&gt;-ubuntu.tar.gz      Ubuntu / macOS bundle (same content; scripts keep their execute bit)</w:t>
       </w:r>
       <w:r>
         <w:rPr>
@@ -2848,15 +2860,13 @@
           <w:sz w:val="16"/>
         </w:rPr>
         <w:br/>
-        <w:t xml:space="preserve">  SHA256SUMS.txt                   checksums of every file in the package</w:t>
       </w:r>
       <w:r>
         <w:rPr>
           <w:rFonts w:ascii="Consolas" w:eastAsia="Consolas" w:hAnsi="Consolas"/>
           <w:sz w:val="16"/>
         </w:rPr>
-        <w:br/>
-        <w:t xml:space="preserve">  dxps-source-&lt;date&gt;.zip           source for Windows (CRLF-safe)</w:t>
+        <w:t>dxps-&lt;version&gt;-evidence.zip       test evidence: tests.json, coverage, probes, govulncheck, gosec, payload traces</w:t>
       </w:r>
       <w:r>
         <w:rPr>
@@ -2864,7 +2874,7 @@
           <w:sz w:val="16"/>
         </w:rPr>
         <w:br/>
-        <w:t xml:space="preserve">  dxps-source-&lt;date&gt;.tar.gz        source for Ubuntu/macOS (scripts keep their execute bit)</w:t>
+        <w:t>SHA256SUMS.txt                    checksums of the files above</w:t>
       </w:r>
       <w:r>
         <w:rPr>
@@ -2872,22 +2882,23 @@
           <w:sz w:val="16"/>
         </w:rPr>
         <w:br/>
-        <w:t xml:space="preserve">  docs/</w:t>
       </w:r>
       <w:r>
         <w:rPr>
           <w:rFonts w:ascii="Consolas" w:eastAsia="Consolas" w:hAnsi="Consolas"/>
           <w:sz w:val="16"/>
         </w:rPr>
+        <w:lastRenderedPageBreak/>
         <w:br/>
+        <w:t>dxps/ (inside each bundle)</w:t>
       </w:r>
       <w:r>
         <w:rPr>
           <w:rFonts w:ascii="Consolas" w:eastAsia="Consolas" w:hAnsi="Consolas"/>
           <w:sz w:val="16"/>
         </w:rPr>
-        <w:lastRenderedPageBreak/>
-        <w:t xml:space="preserve">    DxPS_TO-BE_HLD_LLD.docx/.pdf             design (HLD + LLD)</w:t>
+        <w:br/>
+        <w:t xml:space="preserve">  RELEASE.txt  start here: contents and quick start for the platform</w:t>
       </w:r>
       <w:r>
         <w:rPr>
@@ -2895,7 +2906,7 @@
           <w:sz w:val="16"/>
         </w:rPr>
         <w:br/>
-        <w:t xml:space="preserve">    DxPS_Test_Cases_and_Results.docx/.pdf    test cases, results, security, payloads</w:t>
+        <w:t xml:space="preserve">  cmd/         gateway orchestrator adapter eventhub netsim dashboard dxpsctl</w:t>
       </w:r>
       <w:r>
         <w:rPr>
@@ -2903,7 +2914,7 @@
           <w:sz w:val="16"/>
         </w:rPr>
         <w:br/>
-        <w:t xml:space="preserve">    DxPS_Installation_and_Running_Guide.docx/.pdf   this guide</w:t>
+        <w:t xml:space="preserve">  internal/    24 packages (catalog, planner, saga, bus, store, ...) with their tests</w:t>
       </w:r>
       <w:r>
         <w:rPr>
@@ -2911,7 +2922,7 @@
           <w:sz w:val="16"/>
         </w:rPr>
         <w:br/>
-        <w:t xml:space="preserve">  evidence/                        tests.json, coverage, probes, govulncheck, gosec, payload traces</w:t>
+        <w:t xml:space="preserve">  scripts/     *.ps1 for Windows, *.sh for Ubuntu and macOS</w:t>
       </w:r>
       <w:r>
         <w:rPr>
@@ -2925,8 +2936,7 @@
           <w:rFonts w:ascii="Consolas" w:eastAsia="Consolas" w:hAnsi="Consolas"/>
           <w:sz w:val="16"/>
         </w:rPr>
-        <w:br/>
-        <w:t>dxps/ (inside the source archive)</w:t>
+        <w:t xml:space="preserve">  docs/manuals/  HLD+LLD, Test Cases and Results, Components and Data Guide, this guide (docx + pdf)</w:t>
       </w:r>
       <w:r>
         <w:rPr>
@@ -2934,37 +2944,7 @@
           <w:sz w:val="16"/>
         </w:rPr>
         <w:br/>
-        <w:t xml:space="preserve">  cmd/        gateway orchestrator adapter eventhub netsim dashboard dxpsctl</w:t>
-      </w:r>
-      <w:r>
-        <w:rPr>
-          <w:rFonts w:ascii="Consolas" w:eastAsia="Consolas" w:hAnsi="Consolas"/>
-          <w:sz w:val="16"/>
-        </w:rPr>
-        <w:br/>
-        <w:t xml:space="preserve">  internal/   24 packages (catalog, planner, saga, bus, store, ...) with their tests</w:t>
-      </w:r>
-      <w:r>
-        <w:rPr>
-          <w:rFonts w:ascii="Consolas" w:eastAsia="Consolas" w:hAnsi="Consolas"/>
-          <w:sz w:val="16"/>
-        </w:rPr>
-        <w:br/>
-      </w:r>
-      <w:r>
-        <w:rPr>
-          <w:rFonts w:ascii="Consolas" w:eastAsia="Consolas" w:hAnsi="Consolas"/>
-          <w:sz w:val="16"/>
-        </w:rPr>
-        <w:t xml:space="preserve">  scripts/    *.ps1 for Windows, *.sh for Ubuntu and macOS</w:t>
-      </w:r>
-      <w:r>
-        <w:rPr>
-          <w:rFonts w:ascii="Consolas" w:eastAsia="Consolas" w:hAnsi="Consolas"/>
-          <w:sz w:val="16"/>
-        </w:rPr>
-        <w:br/>
-        <w:t xml:space="preserve">  INSTALL.md  this guide in Markdown</w:t>
+        <w:t xml:space="preserve">  INSTALL.md   this guide in Markdown</w:t>
       </w:r>
     </w:p>
     <w:p>
@@ -3497,7 +3477,7 @@
       <w:pPr>
         <w:pStyle w:val="Heading1"/>
       </w:pPr>
-      <w:bookmarkStart w:id="3" w:name="_Toc242216707"/>
+      <w:bookmarkStart w:id="3" w:name="_Toc242270648"/>
       <w:r>
         <w:rPr>
           <w:color w:val="1E3A8A"/>
@@ -3536,7 +3516,7 @@
           <w:rFonts w:eastAsia="Calibri"/>
           <w:sz w:val="21"/>
         </w:rPr>
-        <w:t>Extract dxps-source-&lt;date&gt;.zip, for example to C:\dxps. Open Windows PowerShell in that folder (the folder that contains go.mod) and allow local scripts for this window only.</w:t>
+        <w:t>Extract dxps-&lt;version&gt;-windows.zip, for example to C:\ (it creates C:\dxps). Open Windows PowerShell in that folder (the folder that contains go.mod) and allow local scripts for this window only.</w:t>
       </w:r>
     </w:p>
     <w:p>
@@ -3558,6 +3538,12 @@
           <w:sz w:val="17"/>
         </w:rPr>
         <w:br/>
+      </w:r>
+      <w:r>
+        <w:rPr>
+          <w:rFonts w:ascii="Consolas" w:eastAsia="Consolas" w:hAnsi="Consolas"/>
+          <w:sz w:val="17"/>
+        </w:rPr>
         <w:t>Set-ExecutionPolicy -Scope Process -ExecutionPolicy Bypass</w:t>
       </w:r>
     </w:p>
@@ -3847,7 +3833,7 @@
       <w:pPr>
         <w:pStyle w:val="Heading1"/>
       </w:pPr>
-      <w:bookmarkStart w:id="4" w:name="_Toc242216708"/>
+      <w:bookmarkStart w:id="4" w:name="_Toc242270649"/>
       <w:r>
         <w:rPr>
           <w:color w:val="1E3A8A"/>
@@ -3900,7 +3886,7 @@
           <w:rFonts w:ascii="Consolas" w:eastAsia="Consolas" w:hAnsi="Consolas"/>
           <w:sz w:val="17"/>
         </w:rPr>
-        <w:t>mkdir -p ~/dxps &amp;&amp; tar -xzf dxps-source-&lt;date&gt;.tar.gz -C ~/dxps --strip-components=1</w:t>
+        <w:t>mkdir -p ~/dxps &amp;&amp; tar -xzf dxps-&lt;version&gt;-ubuntu.tar.gz -C ~/dxps --strip-components=1</w:t>
       </w:r>
       <w:r>
         <w:rPr>
@@ -4170,7 +4156,7 @@
       <w:pPr>
         <w:pStyle w:val="Heading1"/>
       </w:pPr>
-      <w:bookmarkStart w:id="5" w:name="_Toc242216709"/>
+      <w:bookmarkStart w:id="5" w:name="_Toc242270650"/>
       <w:r>
         <w:rPr>
           <w:color w:val="1E3A8A"/>
@@ -4256,6 +4242,18 @@
     </w:p>
     <w:p>
       <w:pPr>
+        <w:spacing w:after="80"/>
+      </w:pPr>
+      <w:r>
+        <w:rPr>
+          <w:rFonts w:eastAsia="Calibri"/>
+          <w:sz w:val="21"/>
+        </w:rPr>
+        <w:t>Use the Ubuntu bundle; it is the same for macOS.</w:t>
+      </w:r>
+    </w:p>
+    <w:p>
+      <w:pPr>
         <w:shd w:val="clear" w:color="auto" w:fill="F3F4F6"/>
         <w:spacing w:before="60" w:after="120"/>
         <w:ind w:left="144"/>
@@ -4265,7 +4263,7 @@
           <w:rFonts w:ascii="Consolas" w:eastAsia="Consolas" w:hAnsi="Consolas"/>
           <w:sz w:val="17"/>
         </w:rPr>
-        <w:t>mkdir -p ~/dxps &amp;&amp; tar -xzf dxps-source-&lt;date&gt;.tar.gz -C ~/dxps --strip-components=1</w:t>
+        <w:t>mkdir -p ~/dxps &amp;&amp; tar -xzf dxps-&lt;version&gt;-ubuntu.tar.gz -C ~/dxps --strip-components=1</w:t>
       </w:r>
       <w:r>
         <w:rPr>
@@ -4523,6 +4521,12 @@
           <w:sz w:val="17"/>
         </w:rPr>
         <w:br/>
+      </w:r>
+      <w:r>
+        <w:rPr>
+          <w:rFonts w:ascii="Consolas" w:eastAsia="Consolas" w:hAnsi="Consolas"/>
+          <w:sz w:val="17"/>
+        </w:rPr>
         <w:t>bash scripts/run-all.sh --no-build</w:t>
       </w:r>
     </w:p>
@@ -4535,7 +4539,7 @@
       <w:pPr>
         <w:pStyle w:val="Heading1"/>
       </w:pPr>
-      <w:bookmarkStart w:id="6" w:name="_Toc242216710"/>
+      <w:bookmarkStart w:id="6" w:name="_Toc242270651"/>
       <w:r>
         <w:rPr>
           <w:color w:val="1E3A8A"/>
@@ -4549,7 +4553,7 @@
       <w:pPr>
         <w:pStyle w:val="Heading2"/>
       </w:pPr>
-      <w:bookmarkStart w:id="7" w:name="_Toc242216711"/>
+      <w:bookmarkStart w:id="7" w:name="_Toc242270652"/>
       <w:r>
         <w:rPr>
           <w:color w:val="1E3A8A"/>
@@ -4645,20 +4649,20 @@
           <w:sz w:val="16"/>
         </w:rPr>
         <w:br/>
-        <w:t xml:space="preserve">      "serviceCharacteristic": [</w:t>
       </w:r>
       <w:r>
         <w:rPr>
           <w:rFonts w:ascii="Consolas" w:eastAsia="Consolas" w:hAnsi="Consolas"/>
           <w:sz w:val="16"/>
         </w:rPr>
-        <w:br/>
+        <w:t xml:space="preserve">      "serviceCharacteristic": [</w:t>
       </w:r>
       <w:r>
         <w:rPr>
           <w:rFonts w:ascii="Consolas" w:eastAsia="Consolas" w:hAnsi="Consolas"/>
           <w:sz w:val="16"/>
         </w:rPr>
+        <w:br/>
         <w:t xml:space="preserve">        {"name": "supi",   "value": "imsi-416770000004321"},</w:t>
       </w:r>
       <w:r>
@@ -4884,7 +4888,7 @@
       <w:pPr>
         <w:pStyle w:val="Heading2"/>
       </w:pPr>
-      <w:bookmarkStart w:id="8" w:name="_Toc242216712"/>
+      <w:bookmarkStart w:id="8" w:name="_Toc242270653"/>
       <w:r>
         <w:rPr>
           <w:color w:val="1E3A8A"/>
@@ -5212,7 +5216,7 @@
       <w:pPr>
         <w:pStyle w:val="Heading2"/>
       </w:pPr>
-      <w:bookmarkStart w:id="9" w:name="_Toc242216713"/>
+      <w:bookmarkStart w:id="9" w:name="_Toc242270654"/>
       <w:r>
         <w:rPr>
           <w:color w:val="1E3A8A"/>
@@ -5519,7 +5523,7 @@
       <w:pPr>
         <w:pStyle w:val="Heading2"/>
       </w:pPr>
-      <w:bookmarkStart w:id="10" w:name="_Toc242216714"/>
+      <w:bookmarkStart w:id="10" w:name="_Toc242270655"/>
       <w:r>
         <w:rPr>
           <w:color w:val="1E3A8A"/>
@@ -5544,7 +5548,7 @@
       <w:pPr>
         <w:pStyle w:val="Heading1"/>
       </w:pPr>
-      <w:bookmarkStart w:id="11" w:name="_Toc242216715"/>
+      <w:bookmarkStart w:id="11" w:name="_Toc242270656"/>
       <w:r>
         <w:rPr>
           <w:color w:val="1E3A8A"/>
@@ -6019,7 +6023,7 @@
       <w:pPr>
         <w:pStyle w:val="Heading1"/>
       </w:pPr>
-      <w:bookmarkStart w:id="12" w:name="_Toc242216716"/>
+      <w:bookmarkStart w:id="12" w:name="_Toc242270657"/>
       <w:r>
         <w:rPr>
           <w:color w:val="1E3A8A"/>
@@ -6428,7 +6432,7 @@
       <w:pPr>
         <w:pStyle w:val="Heading1"/>
       </w:pPr>
-      <w:bookmarkStart w:id="13" w:name="_Toc242216717"/>
+      <w:bookmarkStart w:id="13" w:name="_Toc242270658"/>
       <w:r>
         <w:rPr>
           <w:color w:val="1E3A8A"/>
@@ -6494,7 +6498,7 @@
       <w:pPr>
         <w:pStyle w:val="Heading1"/>
       </w:pPr>
-      <w:bookmarkStart w:id="14" w:name="_Toc242216718"/>
+      <w:bookmarkStart w:id="14" w:name="_Toc242270659"/>
       <w:r>
         <w:rPr>
           <w:color w:val="1E3A8A"/>
@@ -6861,31 +6865,31 @@
       </w:rPr>
     </w:lvl>
   </w:abstractNum>
-  <w:num w:numId="1" w16cid:durableId="347102153">
+  <w:num w:numId="1" w16cid:durableId="1777409439">
     <w:abstractNumId w:val="8"/>
   </w:num>
-  <w:num w:numId="2" w16cid:durableId="456143814">
+  <w:num w:numId="2" w16cid:durableId="947276720">
     <w:abstractNumId w:val="6"/>
   </w:num>
-  <w:num w:numId="3" w16cid:durableId="584605866">
+  <w:num w:numId="3" w16cid:durableId="729109179">
     <w:abstractNumId w:val="5"/>
   </w:num>
-  <w:num w:numId="4" w16cid:durableId="2008945132">
+  <w:num w:numId="4" w16cid:durableId="236670944">
     <w:abstractNumId w:val="4"/>
   </w:num>
-  <w:num w:numId="5" w16cid:durableId="508175368">
+  <w:num w:numId="5" w16cid:durableId="1560439957">
     <w:abstractNumId w:val="7"/>
   </w:num>
-  <w:num w:numId="6" w16cid:durableId="1932152868">
+  <w:num w:numId="6" w16cid:durableId="1396976031">
     <w:abstractNumId w:val="3"/>
   </w:num>
-  <w:num w:numId="7" w16cid:durableId="220217612">
+  <w:num w:numId="7" w16cid:durableId="1725518225">
     <w:abstractNumId w:val="2"/>
   </w:num>
-  <w:num w:numId="8" w16cid:durableId="305865197">
+  <w:num w:numId="8" w16cid:durableId="1178420852">
     <w:abstractNumId w:val="1"/>
   </w:num>
-  <w:num w:numId="9" w16cid:durableId="24445311">
+  <w:num w:numId="9" w16cid:durableId="753555405">
     <w:abstractNumId w:val="0"/>
   </w:num>
 </w:numbering>
@@ -18280,7 +18284,7 @@
     <w:autoRedefine/>
     <w:uiPriority w:val="39"/>
     <w:unhideWhenUsed/>
-    <w:rsid w:val="002247DB"/>
+    <w:rsid w:val="00A638C8"/>
     <w:pPr>
       <w:spacing w:after="100"/>
     </w:pPr>
@@ -18292,7 +18296,7 @@
     <w:autoRedefine/>
     <w:uiPriority w:val="39"/>
     <w:unhideWhenUsed/>
-    <w:rsid w:val="002247DB"/>
+    <w:rsid w:val="00A638C8"/>
     <w:pPr>
       <w:spacing w:after="100"/>
       <w:ind w:left="200"/>
@@ -18303,7 +18307,7 @@
     <w:basedOn w:val="DefaultParagraphFont"/>
     <w:uiPriority w:val="99"/>
     <w:unhideWhenUsed/>
-    <w:rsid w:val="002247DB"/>
+    <w:rsid w:val="00A638C8"/>
     <w:rPr>
       <w:color w:val="0000FF" w:themeColor="hyperlink"/>
       <w:u w:val="single"/>

</xml_diff>